<commit_message>
Documents : insertion du nom (BOUNGOU MBIMI Gloire Bryan), ville et période
</commit_message>
<xml_diff>
--- a/livrables/Cahier_des_charges_CongesFlow.docx
+++ b/livrables/Cahier_des_charges_CongesFlow.docx
@@ -233,7 +233,7 @@
                 <w:sz w:val="18"/>
                 <w:szCs w:val="18"/>
               </w:rPr>
-              <w:t xml:space="preserve">[Nom — ou ESTIAM, projet de fin d'études]</w:t>
+              <w:t xml:space="preserve">ESTIAM (projet de fin d'études)</w:t>
             </w:r>
           </w:p>
         </w:tc>
@@ -287,7 +287,7 @@
                 <w:sz w:val="18"/>
                 <w:szCs w:val="18"/>
               </w:rPr>
-              <w:t xml:space="preserve">[Votre Nom Prénom]</w:t>
+              <w:t xml:space="preserve">BOUNGOU MBIMI Gloire Bryan</w:t>
             </w:r>
           </w:p>
         </w:tc>

</xml_diff>